<commit_message>
Fix SciPy version, consecutive table numbering, figure captions; refresh READMEs; 12pt cover letter; drop orphaned figures and stale markdown
</commit_message>
<xml_diff>
--- a/manuscript/MANUSCRIPT_Discover.docx
+++ b/manuscript/MANUSCRIPT_Discover.docx
@@ -607,18 +607,7 @@
         <w:pStyle w:val="BodyText"/>
       </w:pPr>
       <w:r>
-        <w:t xml:space="preserve">The models were run at temperature 0 and returned a constrained JSON object with the suspicious/not-suspicious decision. Calls that failed or produced unparsable output were logged as errors rather than silently coerced into a valid class; the overall call-level error rate was 0.08%. For the primary per-case analysis, valid replicate decisions were aggregated at the case level according to the prespecified voting procedure, and failed calls were excluded from the aggregation. The exact voting rule—including the treatment of ties and failed calls—is given in Appendix A (Table </w:t>
-      </w:r>
-      <w:hyperlink w:anchor="tab:vote">
-        <w:r>
-          <w:rPr>
-            <w:rStyle w:val="Hyperlink"/>
-          </w:rPr>
-          <w:t xml:space="preserve">1</w:t>
-        </w:r>
-      </w:hyperlink>
-      <w:r>
-        <w:t xml:space="preserve">).</w:t>
+        <w:t xml:space="preserve">The models were run at temperature 0 and returned a constrained JSON object with the suspicious/not-suspicious decision. Calls that failed or produced unparsable output were logged as errors rather than silently coerced into a valid class; the overall call-level error rate was 0.08%. For the primary per-case analysis, valid replicate decisions were aggregated at the case level according to the prespecified voting procedure, and failed calls were excluded from the aggregation. The exact voting rule—including the treatment of ties and failed calls—is given in Appendix A.</w:t>
       </w:r>
     </w:p>
     <w:p>
@@ -1218,7 +1207,7 @@
         <w:pStyle w:val="FirstParagraph"/>
       </w:pPr>
       <w:r>
-        <w:t xml:space="preserve">The analysis was performed in Python 3.12 with NumPy 2.2.6, scikit-learn 1.7.2 [34], SciPy 1.15 and Matplotlib 3.10; the OpenAI and Google Python software development kits were used in data collection. The experimental design and main analyses were preregistered prior to data collection. The reproducibility package includes the case generator, the frozen battery of 600 cases, the full corpus of model responses, configuration information, statistical-analysis code, relevant hashes, and preregistration materials. The analysis pipeline is deterministic and reproduces the reported results from the frozen data.</w:t>
+        <w:t xml:space="preserve">The analysis was performed in Python 3.12 with NumPy 2.2.6, scikit-learn 1.7.2 [34], SciPy 1.18.0 and Matplotlib 3.10; the OpenAI and Google Python software development kits were used in data collection. The experimental design and main analyses were preregistered prior to data collection. The reproducibility package includes the case generator, the frozen battery of 600 cases, the full corpus of model responses, configuration information, statistical-analysis code, relevant hashes, and preregistration materials. The analysis pipeline is deterministic and reproduces the reported results from the frozen data.</w:t>
       </w:r>
     </w:p>
     <w:p>
@@ -1280,7 +1269,7 @@
           <w:rPr>
             <w:rStyle w:val="Hyperlink"/>
           </w:rPr>
-          <w:t xml:space="preserve">2</w:t>
+          <w:t xml:space="preserve">1</w:t>
         </w:r>
       </w:hyperlink>
       <w:r>
@@ -1409,7 +1398,7 @@
           <w:rPr>
             <w:rStyle w:val="Hyperlink"/>
           </w:rPr>
-          <w:t xml:space="preserve">4</w:t>
+          <w:t xml:space="preserve">2</w:t>
         </w:r>
       </w:hyperlink>
       <w:r>
@@ -1457,7 +1446,7 @@
           <w:rPr>
             <w:rStyle w:val="Hyperlink"/>
           </w:rPr>
-          <w:t xml:space="preserve">2</w:t>
+          <w:t xml:space="preserve">1</w:t>
         </w:r>
       </w:hyperlink>
       <w:r>
@@ -2002,7 +1991,7 @@
           <w:rPr>
             <w:rStyle w:val="Hyperlink"/>
           </w:rPr>
-          <w:t xml:space="preserve">1</w:t>
+          <w:t xml:space="preserve">4</w:t>
         </w:r>
       </w:hyperlink>
       <w:r>
@@ -2016,7 +2005,7 @@
           <w:rPr>
             <w:rStyle w:val="Hyperlink"/>
           </w:rPr>
-          <w:t xml:space="preserve">2</w:t>
+          <w:t xml:space="preserve">1</w:t>
         </w:r>
       </w:hyperlink>
       <w:r>
@@ -2026,266 +2015,17 @@
         <w:t xml:space="preserve">and the statistical tests. Because preregistered decision D4 resolves exact splits with reference to the known case label, it is an evaluation aggregation rule rather than a deployable screening rule; it was fixed before the full evaluation and applied identically across models.</w:t>
       </w:r>
     </w:p>
-    <w:bookmarkStart w:id="39" w:name="tab:vote"/>
-    <w:p>
-      <w:pPr>
-        <w:pStyle w:val="TableCaption"/>
-      </w:pPr>
-      <w:r>
-        <w:rPr>
-          <w:b/>
-        </w:rPr>
-        <w:t xml:space="preserve">Per-case endpoint aggregation rule.</w:t>
-      </w:r>
-      <w:r>
-        <w:t xml:space="preserve"> </w:t>
-      </w:r>
-      <w:r>
-        <w:t xml:space="preserve">The rule was fixed in advance (preregistration decision D4); it was applied identically to every model.</w:t>
-      </w:r>
-    </w:p>
-    <w:tbl>
-      <w:tblPr>
-        <w:tblStyle w:val="Table"/>
-        <w:tblW w:type="pct" w:w="0.0"/>
-        <w:tblLook w:firstRow="1"/>
-        <w:tblCaption w:val="Per-case endpoint aggregation rule. The rule was fixed in advance (preregistration decision D4); it was applied identically to every model."/>
-      </w:tblPr>
-      <w:tblGrid/>
-      <w:tr>
-        <w:trPr>
-          <w:cnfStyle w:firstRow="1"/>
-        </w:trPr>
-        <w:tc>
-          <w:tcPr>
-            <w:tcBorders>
-              <w:bottom w:val="single"/>
-            </w:tcBorders>
-            <w:vAlign w:val="bottom"/>
-          </w:tcPr>
-          <w:p>
-            <w:pPr>
-              <w:pStyle w:val="Compact"/>
-              <w:jc w:val="left"/>
-            </w:pPr>
-            <w:r>
-              <w:t xml:space="preserve">Element</w:t>
-            </w:r>
-          </w:p>
-        </w:tc>
-        <w:tc>
-          <w:tcPr>
-            <w:tcBorders>
-              <w:bottom w:val="single"/>
-            </w:tcBorders>
-            <w:vAlign w:val="bottom"/>
-          </w:tcPr>
-          <w:p>
-            <w:pPr>
-              <w:pStyle w:val="Compact"/>
-              <w:jc w:val="left"/>
-            </w:pPr>
-            <w:r>
-              <w:t xml:space="preserve">Rule</w:t>
-            </w:r>
-          </w:p>
-        </w:tc>
-      </w:tr>
-      <w:tr>
-        <w:tc>
-          <w:p>
-            <w:pPr>
-              <w:pStyle w:val="Compact"/>
-              <w:jc w:val="left"/>
-            </w:pPr>
-            <w:r>
-              <w:t xml:space="preserve">Replicate calls per case</w:t>
-            </w:r>
-          </w:p>
-        </w:tc>
-        <w:tc>
-          <w:p>
-            <w:pPr>
-              <w:pStyle w:val="Compact"/>
-              <w:jc w:val="left"/>
-            </w:pPr>
-            <w:r>
-              <w:t xml:space="preserve">The valid (non-ERROR) calls for each (model, case): four by design (two prompt phrasings</w:t>
-            </w:r>
-            <w:r>
-              <w:t xml:space="preserve"> </w:t>
-            </w:r>
-            <m:oMath>
-              <m:r>
-                <m:t>×</m:t>
-              </m:r>
-            </m:oMath>
-            <w:r>
-              <w:t xml:space="preserve"> </w:t>
-            </w:r>
-            <w:r>
-              <w:t xml:space="preserve">two seeds); a small number of cases carry one additional retried call</w:t>
-            </w:r>
-          </w:p>
-        </w:tc>
-      </w:tr>
-      <w:tr>
-        <w:tc>
-          <w:p>
-            <w:pPr>
-              <w:pStyle w:val="Compact"/>
-              <w:jc w:val="left"/>
-            </w:pPr>
-            <w:r>
-              <w:t xml:space="preserve">Failed / unparsable calls</w:t>
-            </w:r>
-          </w:p>
-        </w:tc>
-        <w:tc>
-          <w:p>
-            <w:pPr>
-              <w:pStyle w:val="Compact"/>
-              <w:jc w:val="left"/>
-            </w:pPr>
-            <w:r>
-              <w:t xml:space="preserve">Recorded as ERROR and excluded from the vote (the denominator is reduced accordingly); overall ERROR rate 0.08%</w:t>
-            </w:r>
-          </w:p>
-        </w:tc>
-      </w:tr>
-      <w:tr>
-        <w:tc>
-          <w:p>
-            <w:pPr>
-              <w:pStyle w:val="Compact"/>
-              <w:jc w:val="left"/>
-            </w:pPr>
-            <w:r>
-              <w:t xml:space="preserve">Legitimate (benign) case</w:t>
-            </w:r>
-          </w:p>
-        </w:tc>
-        <w:tc>
-          <w:p>
-            <w:pPr>
-              <w:pStyle w:val="Compact"/>
-              <w:jc w:val="left"/>
-            </w:pPr>
-            <w:r>
-              <w:t xml:space="preserve">Counted as a false positive only if a strict majority of valid calls flagged it (flags</w:t>
-            </w:r>
-            <w:r>
-              <w:t xml:space="preserve"> </w:t>
-            </w:r>
-            <m:oMath>
-              <m:r>
-                <m:t>&gt;</m:t>
-              </m:r>
-            </m:oMath>
-            <w:r>
-              <w:t xml:space="preserve"> </w:t>
-            </w:r>
-            <w:r>
-              <w:t xml:space="preserve">half); a 2–2 tie is not counted as a false positive</w:t>
-            </w:r>
-          </w:p>
-        </w:tc>
-      </w:tr>
-      <w:tr>
-        <w:tc>
-          <w:p>
-            <w:pPr>
-              <w:pStyle w:val="Compact"/>
-              <w:jc w:val="left"/>
-            </w:pPr>
-            <w:r>
-              <w:t xml:space="preserve">Suspicious case</w:t>
-            </w:r>
-          </w:p>
-        </w:tc>
-        <w:tc>
-          <w:p>
-            <w:pPr>
-              <w:pStyle w:val="Compact"/>
-              <w:jc w:val="left"/>
-            </w:pPr>
-            <w:r>
-              <w:t xml:space="preserve">Counted as caught (not missed) if at least half of valid calls flagged it (flags</w:t>
-            </w:r>
-            <w:r>
-              <w:t xml:space="preserve"> </w:t>
-            </w:r>
-            <m:oMath>
-              <m:r>
-                <m:t>≥</m:t>
-              </m:r>
-            </m:oMath>
-            <w:r>
-              <w:t xml:space="preserve"> </w:t>
-            </w:r>
-            <w:r>
-              <w:t xml:space="preserve">half); a 2–2 tie is counted as caught</w:t>
-            </w:r>
-          </w:p>
-        </w:tc>
-      </w:tr>
-      <w:tr>
-        <w:tc>
-          <w:p>
-            <w:pPr>
-              <w:pStyle w:val="Compact"/>
-              <w:jc w:val="left"/>
-            </w:pPr>
-            <w:r>
-              <w:t xml:space="preserve">Even-split ties</w:t>
-            </w:r>
-          </w:p>
-        </w:tc>
-        <w:tc>
-          <w:p>
-            <w:pPr>
-              <w:pStyle w:val="Compact"/>
-              <w:jc w:val="left"/>
-            </w:pPr>
-            <w:r>
-              <w:t xml:space="preserve">Occurred and were resolved as above, affecting 132 of the 1</w:t>
-            </w:r>
-            <w:r>
-              <w:t xml:space="preserve">,</w:t>
-            </w:r>
-            <w:r>
-              <w:t xml:space="preserve">500 benign and 48 of the 1</w:t>
-            </w:r>
-            <w:r>
-              <w:t xml:space="preserve">,</w:t>
-            </w:r>
-            <w:r>
-              <w:t xml:space="preserve">500 suspicious model–case decisions</w:t>
-            </w:r>
-          </w:p>
-        </w:tc>
-      </w:tr>
-      <w:tr>
-        <w:tc>
-          <w:p/>
-        </w:tc>
-        <w:tc>
-          <w:p/>
-        </w:tc>
-      </w:tr>
-    </w:tbl>
-    <w:bookmarkEnd w:id="39"/>
     <w:p>
       <w:pPr>
         <w:pStyle w:val="CaptionedFigure"/>
       </w:pPr>
-      <w:bookmarkStart w:id="41" w:name="fig:fp"/>
+      <w:bookmarkStart w:id="40" w:name="fig:fp"/>
       <w:r>
         <w:drawing>
           <wp:inline>
             <wp:extent cx="4205016" cy="3018437"/>
             <wp:effectExtent b="0" l="0" r="0" t="0"/>
-            <wp:docPr descr="False-positive rate of five foundation models on identical legitimate transactions. Bars show the percentage of 300 legitimate cases each model flagged as suspicious; error bars are 95% Wilson score confidence intervals. Rates span 0.3–83.0% (Cochran’s Q=131.6, degrees of freedom =4, P\approx2\times10^{-27})." title="" id="1" name="Picture"/>
+            <wp:docPr descr="False-positive rate of five foundation models on identical legitimate transactions. Bars show the percentage of 300 legitimate cases each model flagged as suspicious; error bars are 95% Wilson score confidence intervals. Rates span 0.3–83.0% (Cochran’s Q=131.6, degrees of freedom =4, P\approx2\times10^{-27})" title="" id="1" name="Picture"/>
             <a:graphic>
               <a:graphicData uri="http://schemas.openxmlformats.org/drawingml/2006/picture">
                 <pic:pic>
@@ -2296,7 +2036,7 @@
                     </pic:cNvPicPr>
                   </pic:nvPicPr>
                   <pic:blipFill>
-                    <a:blip r:embed="rId40"/>
+                    <a:blip r:embed="rId39"/>
                     <a:stretch>
                       <a:fillRect/>
                     </a:stretch>
@@ -2322,7 +2062,7 @@
           </wp:inline>
         </w:drawing>
       </w:r>
-      <w:bookmarkEnd w:id="41"/>
+      <w:bookmarkEnd w:id="40"/>
     </w:p>
     <w:p>
       <w:pPr>
@@ -2404,20 +2144,20 @@
         </m:sSup>
       </m:oMath>
       <w:r>
-        <w:t xml:space="preserve">).</w:t>
+        <w:t xml:space="preserve">)</w:t>
       </w:r>
     </w:p>
     <w:p>
       <w:pPr>
         <w:pStyle w:val="CaptionedFigure"/>
       </w:pPr>
-      <w:bookmarkStart w:id="43" w:name="fig:ops"/>
+      <w:bookmarkStart w:id="42" w:name="fig:ops"/>
       <w:r>
         <w:drawing>
           <wp:inline>
             <wp:extent cx="4302878" cy="3581145"/>
             <wp:effectExtent b="0" l="0" r="0" t="0"/>
-            <wp:docPr descr="Each model occupies a different operating point. Sensitivity (percentage of 300 suspicious cases caught) versus false-positive rate (percentage of 300 legitimate cases flagged) for the five foundation models (circles) and the two non-LLM baselines (triangles: rules heuristic; supervised classifier). Within each provider in the evaluated model set, the more capable model is consistently associated with a lower false-positive rate." title="" id="1" name="Picture"/>
+            <wp:docPr descr="Each model occupies a different operating point. Sensitivity (percentage of 300 suspicious cases caught) versus false-positive rate (percentage of 300 legitimate cases flagged) for the five foundation models (circles) and the two non-LLM baselines (triangles: rules heuristic; supervised classifier). Within each provider in the evaluated model set, the more capable model is consistently associated with a lower false-positive rate" title="" id="1" name="Picture"/>
             <a:graphic>
               <a:graphicData uri="http://schemas.openxmlformats.org/drawingml/2006/picture">
                 <pic:pic>
@@ -2428,7 +2168,7 @@
                     </pic:cNvPicPr>
                   </pic:nvPicPr>
                   <pic:blipFill>
-                    <a:blip r:embed="rId42"/>
+                    <a:blip r:embed="rId41"/>
                     <a:stretch>
                       <a:fillRect/>
                     </a:stretch>
@@ -2454,7 +2194,7 @@
           </wp:inline>
         </w:drawing>
       </w:r>
-      <w:bookmarkEnd w:id="43"/>
+      <w:bookmarkEnd w:id="42"/>
     </w:p>
     <w:p>
       <w:pPr>
@@ -2470,20 +2210,20 @@
         <w:t xml:space="preserve"> </w:t>
       </w:r>
       <w:r>
-        <w:t xml:space="preserve">Sensitivity (percentage of 300 suspicious cases caught) versus false-positive rate (percentage of 300 legitimate cases flagged) for the five foundation models (circles) and the two non-LLM baselines (triangles: rules heuristic; supervised classifier). Within each provider in the evaluated model set, the more capable model is consistently associated with a lower false-positive rate.</w:t>
+        <w:t xml:space="preserve">Sensitivity (percentage of 300 suspicious cases caught) versus false-positive rate (percentage of 300 legitimate cases flagged) for the five foundation models (circles) and the two non-LLM baselines (triangles: rules heuristic; supervised classifier). Within each provider in the evaluated model set, the more capable model is consistently associated with a lower false-positive rate</w:t>
       </w:r>
     </w:p>
     <w:p>
       <w:pPr>
         <w:pStyle w:val="CaptionedFigure"/>
       </w:pPr>
-      <w:bookmarkStart w:id="45" w:name="fig:vol"/>
+      <w:bookmarkStart w:id="44" w:name="fig:vol"/>
       <w:r>
         <w:drawing>
           <wp:inline>
             <wp:extent cx="4330402" cy="3055135"/>
             <wp:effectExtent b="0" l="0" r="0" t="0"/>
-            <wp:docPr descr="Projected daily alert workload under an illustrative low-prevalence scenario. Expected daily alerts for each screener at a suspicious prevalence of 0.1% over 1,000,000 transactions per day (logarithmic axis). Model choice changes the queue from about 4,200 to about 830,000 alerts on identical activity." title="" id="1" name="Picture"/>
+            <wp:docPr descr="Projected daily alert workload under an illustrative low-prevalence scenario. Expected daily alerts for each screener at a suspicious prevalence of 0.1% over 1,000,000 transactions per day (logarithmic axis). Model choice changes the queue from about 4,200 to about 830,000 alerts on identical activity" title="" id="1" name="Picture"/>
             <a:graphic>
               <a:graphicData uri="http://schemas.openxmlformats.org/drawingml/2006/picture">
                 <pic:pic>
@@ -2494,7 +2234,7 @@
                     </pic:cNvPicPr>
                   </pic:nvPicPr>
                   <pic:blipFill>
-                    <a:blip r:embed="rId44"/>
+                    <a:blip r:embed="rId43"/>
                     <a:stretch>
                       <a:fillRect/>
                     </a:stretch>
@@ -2520,7 +2260,7 @@
           </wp:inline>
         </w:drawing>
       </w:r>
-      <w:bookmarkEnd w:id="45"/>
+      <w:bookmarkEnd w:id="44"/>
     </w:p>
     <w:p>
       <w:pPr>
@@ -2536,20 +2276,20 @@
         <w:t xml:space="preserve"> </w:t>
       </w:r>
       <w:r>
-        <w:t xml:space="preserve">Expected daily alerts for each screener at a suspicious prevalence of 0.1% over 1,000,000 transactions per day (logarithmic axis). Model choice changes the queue from about 4,200 to about 830,000 alerts on identical activity.</w:t>
+        <w:t xml:space="preserve">Expected daily alerts for each screener at a suspicious prevalence of 0.1% over 1,000,000 transactions per day (logarithmic axis). Model choice changes the queue from about 4,200 to about 830,000 alerts on identical activity</w:t>
       </w:r>
     </w:p>
     <w:p>
       <w:pPr>
         <w:pStyle w:val="CaptionedFigure"/>
       </w:pPr>
-      <w:bookmarkStart w:id="47" w:name="fig:typ"/>
+      <w:bookmarkStart w:id="46" w:name="fig:typ"/>
       <w:r>
         <w:drawing>
           <wp:inline>
             <wp:extent cx="4419090" cy="3192754"/>
             <wp:effectExtent b="0" l="0" r="0" t="0"/>
-            <wp:docPr descr="A shared blind spot for trade-based laundering. Miss rate by laundering typology, pooled across the five models; error bars are 95% Wilson score confidence intervals. Trade-based laundering and cash-intensive fronts are missed substantially more often than structural typologies." title="" id="1" name="Picture"/>
+            <wp:docPr descr="A shared blind spot for trade-based laundering. Miss rate by laundering typology, pooled across the five models; error bars are 95% Wilson score confidence intervals. Trade-based laundering and cash-intensive fronts are missed substantially more often than structural typologies" title="" id="1" name="Picture"/>
             <a:graphic>
               <a:graphicData uri="http://schemas.openxmlformats.org/drawingml/2006/picture">
                 <pic:pic>
@@ -2560,7 +2300,7 @@
                     </pic:cNvPicPr>
                   </pic:nvPicPr>
                   <pic:blipFill>
-                    <a:blip r:embed="rId46"/>
+                    <a:blip r:embed="rId45"/>
                     <a:stretch>
                       <a:fillRect/>
                     </a:stretch>
@@ -2586,7 +2326,7 @@
           </wp:inline>
         </w:drawing>
       </w:r>
-      <w:bookmarkEnd w:id="47"/>
+      <w:bookmarkEnd w:id="46"/>
     </w:p>
     <w:p>
       <w:pPr>
@@ -2602,20 +2342,20 @@
         <w:t xml:space="preserve"> </w:t>
       </w:r>
       <w:r>
-        <w:t xml:space="preserve">Miss rate by laundering typology, pooled across the five models; error bars are 95% Wilson score confidence intervals. Trade-based laundering and cash-intensive fronts are missed substantially more often than structural typologies.</w:t>
+        <w:t xml:space="preserve">Miss rate by laundering typology, pooled across the five models; error bars are 95% Wilson score confidence intervals. Trade-based laundering and cash-intensive fronts are missed substantially more often than structural typologies</w:t>
       </w:r>
     </w:p>
     <w:p>
       <w:pPr>
         <w:pStyle w:val="CaptionedFigure"/>
       </w:pPr>
-      <w:bookmarkStart w:id="49" w:name="fig:heat"/>
+      <w:bookmarkStart w:id="48" w:name="fig:heat"/>
       <w:r>
         <w:drawing>
           <wp:inline>
             <wp:extent cx="5334000" cy="3413984"/>
             <wp:effectExtent b="0" l="0" r="0" t="0"/>
-            <wp:docPr descr="Miss rate by laundering typology and model. Percentage of suspicious cases of each typology (rows) missed by each model (columns); darker cells indicate more misses. The cautious models (Gemini Flash, GPT-4o) concentrate their misses in trade-based laundering and cash-intensive fronts, while the alert-flooding GPT-4o-mini misses almost nothing—the per-typology signature of the operating-point trade-off in Fig. 2." title="" id="1" name="Picture"/>
+            <wp:docPr descr="Miss rate by laundering typology and model. Percentage of suspicious cases of each typology (rows) missed by each model (columns); darker cells indicate more misses. The cautious models (Gemini Flash, GPT-4o) concentrate their misses in trade-based laundering and cash-intensive fronts, while the alert-flooding GPT-4o-mini misses almost nothing—the per-typology signature of the operating-point trade-off in Fig. 2" title="" id="1" name="Picture"/>
             <a:graphic>
               <a:graphicData uri="http://schemas.openxmlformats.org/drawingml/2006/picture">
                 <pic:pic>
@@ -2626,7 +2366,7 @@
                     </pic:cNvPicPr>
                   </pic:nvPicPr>
                   <pic:blipFill>
-                    <a:blip r:embed="rId48"/>
+                    <a:blip r:embed="rId47"/>
                     <a:stretch>
                       <a:fillRect/>
                     </a:stretch>
@@ -2652,7 +2392,7 @@
           </wp:inline>
         </w:drawing>
       </w:r>
-      <w:bookmarkEnd w:id="49"/>
+      <w:bookmarkEnd w:id="48"/>
     </w:p>
     <w:p>
       <w:pPr>
@@ -2678,11 +2418,8 @@
           <w:t xml:space="preserve">2</w:t>
         </w:r>
       </w:hyperlink>
-      <w:r>
-        <w:t xml:space="preserve">.</w:t>
-      </w:r>
-    </w:p>
-    <w:bookmarkStart w:id="50" w:name="tab:ops"/>
+    </w:p>
+    <w:bookmarkStart w:id="49" w:name="tab:ops"/>
     <w:p>
       <w:pPr>
         <w:pStyle w:val="TableCaption"/>
@@ -3046,564 +2783,8 @@
         </w:tc>
       </w:tr>
     </w:tbl>
-    <w:bookmarkEnd w:id="50"/>
-    <w:bookmarkStart w:id="51" w:name="tab:vol"/>
-    <w:p>
-      <w:pPr>
-        <w:pStyle w:val="TableCaption"/>
-      </w:pPr>
-      <w:r>
-        <w:rPr>
-          <w:b/>
-        </w:rPr>
-        <w:t xml:space="preserve">Projected daily operational impact at 0.1% prevalence (1,000,000 transactions/day).</w:t>
-      </w:r>
-      <w:r>
-        <w:t xml:space="preserve"> </w:t>
-      </w:r>
-      <w:r>
-        <w:t xml:space="preserve">Projected daily-alert counts show an FPR-uncertainty interval obtained by propagating the 95% Wilson interval for the false-positive rate; counts are rounded to three significant figures. Rules and supervised baselines are shown for reference; the supervised baseline is an optimistic ceiling on synthetic structure.</w:t>
-      </w:r>
-    </w:p>
-    <w:tbl>
-      <w:tblPr>
-        <w:tblStyle w:val="Table"/>
-        <w:tblW w:type="pct" w:w="0.0"/>
-        <w:tblLook w:firstRow="1"/>
-        <w:tblCaption w:val="Projected daily operational impact at 0.1% prevalence (1,000,000 transactions/day). Projected daily-alert counts show an FPR-uncertainty interval obtained by propagating the 95% Wilson interval for the false-positive rate; counts are rounded to three significant figures. Rules and supervised baselines are shown for reference; the supervised baseline is an optimistic ceiling on synthetic structure."/>
-      </w:tblPr>
-      <w:tblGrid/>
-      <w:tr>
-        <w:trPr>
-          <w:cnfStyle w:firstRow="1"/>
-        </w:trPr>
-        <w:tc>
-          <w:tcPr>
-            <w:tcBorders>
-              <w:bottom w:val="single"/>
-            </w:tcBorders>
-            <w:vAlign w:val="bottom"/>
-          </w:tcPr>
-          <w:p>
-            <w:pPr>
-              <w:pStyle w:val="Compact"/>
-              <w:jc w:val="left"/>
-            </w:pPr>
-            <w:r>
-              <w:t xml:space="preserve">Screener</w:t>
-            </w:r>
-          </w:p>
-        </w:tc>
-        <w:tc>
-          <w:tcPr>
-            <w:tcBorders>
-              <w:bottom w:val="single"/>
-            </w:tcBorders>
-            <w:vAlign w:val="bottom"/>
-          </w:tcPr>
-          <w:p>
-            <w:pPr>
-              <w:pStyle w:val="Compact"/>
-              <w:jc w:val="right"/>
-            </w:pPr>
-            <w:r>
-              <w:t xml:space="preserve">FP rate (%)</w:t>
-            </w:r>
-          </w:p>
-        </w:tc>
-        <w:tc>
-          <w:tcPr>
-            <w:tcBorders>
-              <w:bottom w:val="single"/>
-            </w:tcBorders>
-            <w:vAlign w:val="bottom"/>
-          </w:tcPr>
-          <w:p>
-            <w:pPr>
-              <w:pStyle w:val="Compact"/>
-              <w:jc w:val="left"/>
-            </w:pPr>
-            <w:r>
-              <w:t xml:space="preserve">Projected daily alerts (95% CI)</w:t>
-            </w:r>
-          </w:p>
-        </w:tc>
-        <w:tc>
-          <w:tcPr>
-            <w:tcBorders>
-              <w:bottom w:val="single"/>
-            </w:tcBorders>
-            <w:vAlign w:val="bottom"/>
-          </w:tcPr>
-          <w:p>
-            <w:pPr>
-              <w:pStyle w:val="Compact"/>
-              <w:jc w:val="right"/>
-            </w:pPr>
-            <w:r>
-              <w:t xml:space="preserve">Precision (%)</w:t>
-            </w:r>
-          </w:p>
-        </w:tc>
-      </w:tr>
-      <w:tr>
-        <w:tc>
-          <w:p>
-            <w:pPr>
-              <w:pStyle w:val="Compact"/>
-              <w:jc w:val="left"/>
-            </w:pPr>
-            <w:r>
-              <w:t xml:space="preserve">Supervised (ceiling)</w:t>
-            </w:r>
-          </w:p>
-        </w:tc>
-        <w:tc>
-          <w:p>
-            <w:pPr>
-              <w:pStyle w:val="Compact"/>
-              <w:jc w:val="right"/>
-            </w:pPr>
-            <w:r>
-              <w:t xml:space="preserve">0.0</w:t>
-            </w:r>
-          </w:p>
-        </w:tc>
-        <w:tc>
-          <w:p>
-            <w:pPr>
-              <w:pStyle w:val="Compact"/>
-              <w:jc w:val="left"/>
-            </w:pPr>
-            <m:oMath>
-              <m:r>
-                <m:t>∼</m:t>
-              </m:r>
-            </m:oMath>
-            <w:r>
-              <w:t xml:space="preserve">1</w:t>
-            </w:r>
-            <w:r>
-              <w:t xml:space="preserve">,</w:t>
-            </w:r>
-            <w:r>
-              <w:t xml:space="preserve">000</w:t>
-            </w:r>
-          </w:p>
-        </w:tc>
-        <w:tc>
-          <w:p>
-            <w:pPr>
-              <w:pStyle w:val="Compact"/>
-              <w:jc w:val="right"/>
-            </w:pPr>
-            <w:r>
-              <w:t xml:space="preserve">100</w:t>
-            </w:r>
-          </w:p>
-        </w:tc>
-      </w:tr>
-      <w:tr>
-        <w:tc>
-          <w:p>
-            <w:pPr>
-              <w:pStyle w:val="Compact"/>
-              <w:jc w:val="left"/>
-            </w:pPr>
-            <w:r>
-              <w:t xml:space="preserve">Gemini Flash</w:t>
-            </w:r>
-          </w:p>
-        </w:tc>
-        <w:tc>
-          <w:p>
-            <w:pPr>
-              <w:pStyle w:val="Compact"/>
-              <w:jc w:val="right"/>
-            </w:pPr>
-            <w:r>
-              <w:t xml:space="preserve">0.3</w:t>
-            </w:r>
-          </w:p>
-        </w:tc>
-        <w:tc>
-          <w:p>
-            <w:pPr>
-              <w:pStyle w:val="Compact"/>
-              <w:jc w:val="left"/>
-            </w:pPr>
-            <w:r>
-              <w:t xml:space="preserve">4</w:t>
-            </w:r>
-            <w:r>
-              <w:t xml:space="preserve">,</w:t>
-            </w:r>
-            <w:r>
-              <w:t xml:space="preserve">200 (1</w:t>
-            </w:r>
-            <w:r>
-              <w:t xml:space="preserve">,</w:t>
-            </w:r>
-            <w:r>
-              <w:t xml:space="preserve">500–19</w:t>
-            </w:r>
-            <w:r>
-              <w:t xml:space="preserve">,</w:t>
-            </w:r>
-            <w:r>
-              <w:t xml:space="preserve">500)</w:t>
-            </w:r>
-          </w:p>
-        </w:tc>
-        <w:tc>
-          <w:p>
-            <w:pPr>
-              <w:pStyle w:val="Compact"/>
-              <w:jc w:val="right"/>
-            </w:pPr>
-            <w:r>
-              <w:t xml:space="preserve">20.9</w:t>
-            </w:r>
-          </w:p>
-        </w:tc>
-      </w:tr>
-      <w:tr>
-        <w:tc>
-          <w:p>
-            <w:pPr>
-              <w:pStyle w:val="Compact"/>
-              <w:jc w:val="left"/>
-            </w:pPr>
-            <w:r>
-              <w:t xml:space="preserve">GPT-4o</w:t>
-            </w:r>
-          </w:p>
-        </w:tc>
-        <w:tc>
-          <w:p>
-            <w:pPr>
-              <w:pStyle w:val="Compact"/>
-              <w:jc w:val="right"/>
-            </w:pPr>
-            <w:r>
-              <w:t xml:space="preserve">1.0</w:t>
-            </w:r>
-          </w:p>
-        </w:tc>
-        <w:tc>
-          <w:p>
-            <w:pPr>
-              <w:pStyle w:val="Compact"/>
-              <w:jc w:val="left"/>
-            </w:pPr>
-            <w:r>
-              <w:t xml:space="preserve">11</w:t>
-            </w:r>
-            <w:r>
-              <w:t xml:space="preserve">,</w:t>
-            </w:r>
-            <w:r>
-              <w:t xml:space="preserve">000 (4</w:t>
-            </w:r>
-            <w:r>
-              <w:t xml:space="preserve">,</w:t>
-            </w:r>
-            <w:r>
-              <w:t xml:space="preserve">400–29</w:t>
-            </w:r>
-            <w:r>
-              <w:t xml:space="preserve">,</w:t>
-            </w:r>
-            <w:r>
-              <w:t xml:space="preserve">900)</w:t>
-            </w:r>
-          </w:p>
-        </w:tc>
-        <w:tc>
-          <w:p>
-            <w:pPr>
-              <w:pStyle w:val="Compact"/>
-              <w:jc w:val="right"/>
-            </w:pPr>
-            <w:r>
-              <w:t xml:space="preserve">8.8</w:t>
-            </w:r>
-          </w:p>
-        </w:tc>
-      </w:tr>
-      <w:tr>
-        <w:tc>
-          <w:p>
-            <w:pPr>
-              <w:pStyle w:val="Compact"/>
-              <w:jc w:val="left"/>
-            </w:pPr>
-            <w:r>
-              <w:t xml:space="preserve">Rules baseline</w:t>
-            </w:r>
-          </w:p>
-        </w:tc>
-        <w:tc>
-          <w:p>
-            <w:pPr>
-              <w:pStyle w:val="Compact"/>
-              <w:jc w:val="right"/>
-            </w:pPr>
-            <w:r>
-              <w:t xml:space="preserve">12.0</w:t>
-            </w:r>
-          </w:p>
-        </w:tc>
-        <w:tc>
-          <w:p>
-            <w:pPr>
-              <w:pStyle w:val="Compact"/>
-              <w:jc w:val="left"/>
-            </w:pPr>
-            <w:r>
-              <w:t xml:space="preserve">121</w:t>
-            </w:r>
-            <w:r>
-              <w:t xml:space="preserve">,</w:t>
-            </w:r>
-            <w:r>
-              <w:t xml:space="preserve">000 (88</w:t>
-            </w:r>
-            <w:r>
-              <w:t xml:space="preserve">,</w:t>
-            </w:r>
-            <w:r>
-              <w:t xml:space="preserve">700–162</w:t>
-            </w:r>
-            <w:r>
-              <w:t xml:space="preserve">,</w:t>
-            </w:r>
-            <w:r>
-              <w:t xml:space="preserve">000)</w:t>
-            </w:r>
-          </w:p>
-        </w:tc>
-        <w:tc>
-          <w:p>
-            <w:pPr>
-              <w:pStyle w:val="Compact"/>
-              <w:jc w:val="right"/>
-            </w:pPr>
-            <w:r>
-              <w:t xml:space="preserve">0.7</w:t>
-            </w:r>
-          </w:p>
-        </w:tc>
-      </w:tr>
-      <w:tr>
-        <w:tc>
-          <w:p>
-            <w:pPr>
-              <w:pStyle w:val="Compact"/>
-              <w:jc w:val="left"/>
-            </w:pPr>
-            <w:r>
-              <w:t xml:space="preserve">GPT-4.1-mini</w:t>
-            </w:r>
-          </w:p>
-        </w:tc>
-        <w:tc>
-          <w:p>
-            <w:pPr>
-              <w:pStyle w:val="Compact"/>
-              <w:jc w:val="right"/>
-            </w:pPr>
-            <w:r>
-              <w:t xml:space="preserve">23.7</w:t>
-            </w:r>
-          </w:p>
-        </w:tc>
-        <w:tc>
-          <w:p>
-            <w:pPr>
-              <w:pStyle w:val="Compact"/>
-              <w:jc w:val="left"/>
-            </w:pPr>
-            <w:r>
-              <w:t xml:space="preserve">237</w:t>
-            </w:r>
-            <w:r>
-              <w:t xml:space="preserve">,</w:t>
-            </w:r>
-            <w:r>
-              <w:t xml:space="preserve">000 (193</w:t>
-            </w:r>
-            <w:r>
-              <w:t xml:space="preserve">,</w:t>
-            </w:r>
-            <w:r>
-              <w:t xml:space="preserve">000–289</w:t>
-            </w:r>
-            <w:r>
-              <w:t xml:space="preserve">,</w:t>
-            </w:r>
-            <w:r>
-              <w:t xml:space="preserve">000)</w:t>
-            </w:r>
-          </w:p>
-        </w:tc>
-        <w:tc>
-          <w:p>
-            <w:pPr>
-              <w:pStyle w:val="Compact"/>
-              <w:jc w:val="right"/>
-            </w:pPr>
-            <w:r>
-              <w:t xml:space="preserve">0.4</w:t>
-            </w:r>
-          </w:p>
-        </w:tc>
-      </w:tr>
-      <w:tr>
-        <w:tc>
-          <w:p>
-            <w:pPr>
-              <w:pStyle w:val="Compact"/>
-              <w:jc w:val="left"/>
-            </w:pPr>
-            <w:r>
-              <w:t xml:space="preserve">Gemini Flash-Lite</w:t>
-            </w:r>
-          </w:p>
-        </w:tc>
-        <w:tc>
-          <w:p>
-            <w:pPr>
-              <w:pStyle w:val="Compact"/>
-              <w:jc w:val="right"/>
-            </w:pPr>
-            <w:r>
-              <w:t xml:space="preserve">24.7</w:t>
-            </w:r>
-          </w:p>
-        </w:tc>
-        <w:tc>
-          <w:p>
-            <w:pPr>
-              <w:pStyle w:val="Compact"/>
-              <w:jc w:val="left"/>
-            </w:pPr>
-            <w:r>
-              <w:t xml:space="preserve">247</w:t>
-            </w:r>
-            <w:r>
-              <w:t xml:space="preserve">,</w:t>
-            </w:r>
-            <w:r>
-              <w:t xml:space="preserve">000 (202</w:t>
-            </w:r>
-            <w:r>
-              <w:t xml:space="preserve">,</w:t>
-            </w:r>
-            <w:r>
-              <w:t xml:space="preserve">000–299</w:t>
-            </w:r>
-            <w:r>
-              <w:t xml:space="preserve">,</w:t>
-            </w:r>
-            <w:r>
-              <w:t xml:space="preserve">000)</w:t>
-            </w:r>
-          </w:p>
-        </w:tc>
-        <w:tc>
-          <w:p>
-            <w:pPr>
-              <w:pStyle w:val="Compact"/>
-              <w:jc w:val="right"/>
-            </w:pPr>
-            <w:r>
-              <w:t xml:space="preserve">0.4</w:t>
-            </w:r>
-          </w:p>
-        </w:tc>
-      </w:tr>
-      <w:tr>
-        <w:tc>
-          <w:p>
-            <w:pPr>
-              <w:pStyle w:val="Compact"/>
-              <w:jc w:val="left"/>
-            </w:pPr>
-            <w:r>
-              <w:t xml:space="preserve">GPT-4o-mini</w:t>
-            </w:r>
-          </w:p>
-        </w:tc>
-        <w:tc>
-          <w:p>
-            <w:pPr>
-              <w:pStyle w:val="Compact"/>
-              <w:jc w:val="right"/>
-            </w:pPr>
-            <w:r>
-              <w:t xml:space="preserve">83.0</w:t>
-            </w:r>
-          </w:p>
-        </w:tc>
-        <w:tc>
-          <w:p>
-            <w:pPr>
-              <w:pStyle w:val="Compact"/>
-              <w:jc w:val="left"/>
-            </w:pPr>
-            <w:r>
-              <w:t xml:space="preserve">830</w:t>
-            </w:r>
-            <w:r>
-              <w:t xml:space="preserve">,</w:t>
-            </w:r>
-            <w:r>
-              <w:t xml:space="preserve">000 (784</w:t>
-            </w:r>
-            <w:r>
-              <w:t xml:space="preserve">,</w:t>
-            </w:r>
-            <w:r>
-              <w:t xml:space="preserve">000–868</w:t>
-            </w:r>
-            <w:r>
-              <w:t xml:space="preserve">,</w:t>
-            </w:r>
-            <w:r>
-              <w:t xml:space="preserve">000)</w:t>
-            </w:r>
-          </w:p>
-        </w:tc>
-        <w:tc>
-          <w:p>
-            <w:pPr>
-              <w:pStyle w:val="Compact"/>
-              <w:jc w:val="right"/>
-            </w:pPr>
-            <w:r>
-              <w:t xml:space="preserve">0.1</w:t>
-            </w:r>
-          </w:p>
-        </w:tc>
-      </w:tr>
-      <w:tr>
-        <w:tc>
-          <w:p/>
-        </w:tc>
-        <w:tc>
-          <w:p/>
-        </w:tc>
-        <w:tc>
-          <w:p/>
-        </w:tc>
-        <w:tc>
-          <w:p/>
-        </w:tc>
-      </w:tr>
-    </w:tbl>
-    <w:bookmarkEnd w:id="51"/>
-    <w:bookmarkStart w:id="52" w:name="tab:mcnemar"/>
+    <w:bookmarkEnd w:id="49"/>
+    <w:bookmarkStart w:id="50" w:name="tab:mcnemar"/>
     <w:p>
       <w:pPr>
         <w:pStyle w:val="TableCaption"/>
@@ -4406,6 +3587,811 @@
         <w:tc>
           <w:p/>
         </w:tc>
+        <w:tc>
+          <w:p/>
+        </w:tc>
+        <w:tc>
+          <w:p/>
+        </w:tc>
+      </w:tr>
+    </w:tbl>
+    <w:bookmarkEnd w:id="50"/>
+    <w:bookmarkStart w:id="51" w:name="tab:vol"/>
+    <w:p>
+      <w:pPr>
+        <w:pStyle w:val="TableCaption"/>
+      </w:pPr>
+      <w:r>
+        <w:rPr>
+          <w:b/>
+        </w:rPr>
+        <w:t xml:space="preserve">Projected daily operational impact at 0.1% prevalence (1,000,000 transactions/day).</w:t>
+      </w:r>
+      <w:r>
+        <w:t xml:space="preserve"> </w:t>
+      </w:r>
+      <w:r>
+        <w:t xml:space="preserve">Projected daily-alert counts show an FPR-uncertainty interval obtained by propagating the 95% Wilson interval for the false-positive rate; counts are rounded to three significant figures. Rules and supervised baselines are shown for reference; the supervised baseline is an optimistic ceiling on synthetic structure.</w:t>
+      </w:r>
+    </w:p>
+    <w:tbl>
+      <w:tblPr>
+        <w:tblStyle w:val="Table"/>
+        <w:tblW w:type="pct" w:w="0.0"/>
+        <w:tblLook w:firstRow="1"/>
+        <w:tblCaption w:val="Projected daily operational impact at 0.1% prevalence (1,000,000 transactions/day). Projected daily-alert counts show an FPR-uncertainty interval obtained by propagating the 95% Wilson interval for the false-positive rate; counts are rounded to three significant figures. Rules and supervised baselines are shown for reference; the supervised baseline is an optimistic ceiling on synthetic structure."/>
+      </w:tblPr>
+      <w:tblGrid/>
+      <w:tr>
+        <w:trPr>
+          <w:cnfStyle w:firstRow="1"/>
+        </w:trPr>
+        <w:tc>
+          <w:tcPr>
+            <w:tcBorders>
+              <w:bottom w:val="single"/>
+            </w:tcBorders>
+            <w:vAlign w:val="bottom"/>
+          </w:tcPr>
+          <w:p>
+            <w:pPr>
+              <w:pStyle w:val="Compact"/>
+              <w:jc w:val="left"/>
+            </w:pPr>
+            <w:r>
+              <w:t xml:space="preserve">Screener</w:t>
+            </w:r>
+          </w:p>
+        </w:tc>
+        <w:tc>
+          <w:tcPr>
+            <w:tcBorders>
+              <w:bottom w:val="single"/>
+            </w:tcBorders>
+            <w:vAlign w:val="bottom"/>
+          </w:tcPr>
+          <w:p>
+            <w:pPr>
+              <w:pStyle w:val="Compact"/>
+              <w:jc w:val="right"/>
+            </w:pPr>
+            <w:r>
+              <w:t xml:space="preserve">FP rate (%)</w:t>
+            </w:r>
+          </w:p>
+        </w:tc>
+        <w:tc>
+          <w:tcPr>
+            <w:tcBorders>
+              <w:bottom w:val="single"/>
+            </w:tcBorders>
+            <w:vAlign w:val="bottom"/>
+          </w:tcPr>
+          <w:p>
+            <w:pPr>
+              <w:pStyle w:val="Compact"/>
+              <w:jc w:val="left"/>
+            </w:pPr>
+            <w:r>
+              <w:t xml:space="preserve">Projected daily alerts (95% CI)</w:t>
+            </w:r>
+          </w:p>
+        </w:tc>
+        <w:tc>
+          <w:tcPr>
+            <w:tcBorders>
+              <w:bottom w:val="single"/>
+            </w:tcBorders>
+            <w:vAlign w:val="bottom"/>
+          </w:tcPr>
+          <w:p>
+            <w:pPr>
+              <w:pStyle w:val="Compact"/>
+              <w:jc w:val="right"/>
+            </w:pPr>
+            <w:r>
+              <w:t xml:space="preserve">Precision (%)</w:t>
+            </w:r>
+          </w:p>
+        </w:tc>
+      </w:tr>
+      <w:tr>
+        <w:tc>
+          <w:p>
+            <w:pPr>
+              <w:pStyle w:val="Compact"/>
+              <w:jc w:val="left"/>
+            </w:pPr>
+            <w:r>
+              <w:t xml:space="preserve">Supervised (ceiling)</w:t>
+            </w:r>
+          </w:p>
+        </w:tc>
+        <w:tc>
+          <w:p>
+            <w:pPr>
+              <w:pStyle w:val="Compact"/>
+              <w:jc w:val="right"/>
+            </w:pPr>
+            <w:r>
+              <w:t xml:space="preserve">0.0</w:t>
+            </w:r>
+          </w:p>
+        </w:tc>
+        <w:tc>
+          <w:p>
+            <w:pPr>
+              <w:pStyle w:val="Compact"/>
+              <w:jc w:val="left"/>
+            </w:pPr>
+            <m:oMath>
+              <m:r>
+                <m:t>∼</m:t>
+              </m:r>
+            </m:oMath>
+            <w:r>
+              <w:t xml:space="preserve">1</w:t>
+            </w:r>
+            <w:r>
+              <w:t xml:space="preserve">,</w:t>
+            </w:r>
+            <w:r>
+              <w:t xml:space="preserve">000</w:t>
+            </w:r>
+          </w:p>
+        </w:tc>
+        <w:tc>
+          <w:p>
+            <w:pPr>
+              <w:pStyle w:val="Compact"/>
+              <w:jc w:val="right"/>
+            </w:pPr>
+            <w:r>
+              <w:t xml:space="preserve">100</w:t>
+            </w:r>
+          </w:p>
+        </w:tc>
+      </w:tr>
+      <w:tr>
+        <w:tc>
+          <w:p>
+            <w:pPr>
+              <w:pStyle w:val="Compact"/>
+              <w:jc w:val="left"/>
+            </w:pPr>
+            <w:r>
+              <w:t xml:space="preserve">Gemini Flash</w:t>
+            </w:r>
+          </w:p>
+        </w:tc>
+        <w:tc>
+          <w:p>
+            <w:pPr>
+              <w:pStyle w:val="Compact"/>
+              <w:jc w:val="right"/>
+            </w:pPr>
+            <w:r>
+              <w:t xml:space="preserve">0.3</w:t>
+            </w:r>
+          </w:p>
+        </w:tc>
+        <w:tc>
+          <w:p>
+            <w:pPr>
+              <w:pStyle w:val="Compact"/>
+              <w:jc w:val="left"/>
+            </w:pPr>
+            <w:r>
+              <w:t xml:space="preserve">4</w:t>
+            </w:r>
+            <w:r>
+              <w:t xml:space="preserve">,</w:t>
+            </w:r>
+            <w:r>
+              <w:t xml:space="preserve">200 (1</w:t>
+            </w:r>
+            <w:r>
+              <w:t xml:space="preserve">,</w:t>
+            </w:r>
+            <w:r>
+              <w:t xml:space="preserve">500–19</w:t>
+            </w:r>
+            <w:r>
+              <w:t xml:space="preserve">,</w:t>
+            </w:r>
+            <w:r>
+              <w:t xml:space="preserve">500)</w:t>
+            </w:r>
+          </w:p>
+        </w:tc>
+        <w:tc>
+          <w:p>
+            <w:pPr>
+              <w:pStyle w:val="Compact"/>
+              <w:jc w:val="right"/>
+            </w:pPr>
+            <w:r>
+              <w:t xml:space="preserve">20.9</w:t>
+            </w:r>
+          </w:p>
+        </w:tc>
+      </w:tr>
+      <w:tr>
+        <w:tc>
+          <w:p>
+            <w:pPr>
+              <w:pStyle w:val="Compact"/>
+              <w:jc w:val="left"/>
+            </w:pPr>
+            <w:r>
+              <w:t xml:space="preserve">GPT-4o</w:t>
+            </w:r>
+          </w:p>
+        </w:tc>
+        <w:tc>
+          <w:p>
+            <w:pPr>
+              <w:pStyle w:val="Compact"/>
+              <w:jc w:val="right"/>
+            </w:pPr>
+            <w:r>
+              <w:t xml:space="preserve">1.0</w:t>
+            </w:r>
+          </w:p>
+        </w:tc>
+        <w:tc>
+          <w:p>
+            <w:pPr>
+              <w:pStyle w:val="Compact"/>
+              <w:jc w:val="left"/>
+            </w:pPr>
+            <w:r>
+              <w:t xml:space="preserve">11</w:t>
+            </w:r>
+            <w:r>
+              <w:t xml:space="preserve">,</w:t>
+            </w:r>
+            <w:r>
+              <w:t xml:space="preserve">000 (4</w:t>
+            </w:r>
+            <w:r>
+              <w:t xml:space="preserve">,</w:t>
+            </w:r>
+            <w:r>
+              <w:t xml:space="preserve">400–29</w:t>
+            </w:r>
+            <w:r>
+              <w:t xml:space="preserve">,</w:t>
+            </w:r>
+            <w:r>
+              <w:t xml:space="preserve">900)</w:t>
+            </w:r>
+          </w:p>
+        </w:tc>
+        <w:tc>
+          <w:p>
+            <w:pPr>
+              <w:pStyle w:val="Compact"/>
+              <w:jc w:val="right"/>
+            </w:pPr>
+            <w:r>
+              <w:t xml:space="preserve">8.8</w:t>
+            </w:r>
+          </w:p>
+        </w:tc>
+      </w:tr>
+      <w:tr>
+        <w:tc>
+          <w:p>
+            <w:pPr>
+              <w:pStyle w:val="Compact"/>
+              <w:jc w:val="left"/>
+            </w:pPr>
+            <w:r>
+              <w:t xml:space="preserve">Rules baseline</w:t>
+            </w:r>
+          </w:p>
+        </w:tc>
+        <w:tc>
+          <w:p>
+            <w:pPr>
+              <w:pStyle w:val="Compact"/>
+              <w:jc w:val="right"/>
+            </w:pPr>
+            <w:r>
+              <w:t xml:space="preserve">12.0</w:t>
+            </w:r>
+          </w:p>
+        </w:tc>
+        <w:tc>
+          <w:p>
+            <w:pPr>
+              <w:pStyle w:val="Compact"/>
+              <w:jc w:val="left"/>
+            </w:pPr>
+            <w:r>
+              <w:t xml:space="preserve">121</w:t>
+            </w:r>
+            <w:r>
+              <w:t xml:space="preserve">,</w:t>
+            </w:r>
+            <w:r>
+              <w:t xml:space="preserve">000 (88</w:t>
+            </w:r>
+            <w:r>
+              <w:t xml:space="preserve">,</w:t>
+            </w:r>
+            <w:r>
+              <w:t xml:space="preserve">700–162</w:t>
+            </w:r>
+            <w:r>
+              <w:t xml:space="preserve">,</w:t>
+            </w:r>
+            <w:r>
+              <w:t xml:space="preserve">000)</w:t>
+            </w:r>
+          </w:p>
+        </w:tc>
+        <w:tc>
+          <w:p>
+            <w:pPr>
+              <w:pStyle w:val="Compact"/>
+              <w:jc w:val="right"/>
+            </w:pPr>
+            <w:r>
+              <w:t xml:space="preserve">0.7</w:t>
+            </w:r>
+          </w:p>
+        </w:tc>
+      </w:tr>
+      <w:tr>
+        <w:tc>
+          <w:p>
+            <w:pPr>
+              <w:pStyle w:val="Compact"/>
+              <w:jc w:val="left"/>
+            </w:pPr>
+            <w:r>
+              <w:t xml:space="preserve">GPT-4.1-mini</w:t>
+            </w:r>
+          </w:p>
+        </w:tc>
+        <w:tc>
+          <w:p>
+            <w:pPr>
+              <w:pStyle w:val="Compact"/>
+              <w:jc w:val="right"/>
+            </w:pPr>
+            <w:r>
+              <w:t xml:space="preserve">23.7</w:t>
+            </w:r>
+          </w:p>
+        </w:tc>
+        <w:tc>
+          <w:p>
+            <w:pPr>
+              <w:pStyle w:val="Compact"/>
+              <w:jc w:val="left"/>
+            </w:pPr>
+            <w:r>
+              <w:t xml:space="preserve">237</w:t>
+            </w:r>
+            <w:r>
+              <w:t xml:space="preserve">,</w:t>
+            </w:r>
+            <w:r>
+              <w:t xml:space="preserve">000 (193</w:t>
+            </w:r>
+            <w:r>
+              <w:t xml:space="preserve">,</w:t>
+            </w:r>
+            <w:r>
+              <w:t xml:space="preserve">000–289</w:t>
+            </w:r>
+            <w:r>
+              <w:t xml:space="preserve">,</w:t>
+            </w:r>
+            <w:r>
+              <w:t xml:space="preserve">000)</w:t>
+            </w:r>
+          </w:p>
+        </w:tc>
+        <w:tc>
+          <w:p>
+            <w:pPr>
+              <w:pStyle w:val="Compact"/>
+              <w:jc w:val="right"/>
+            </w:pPr>
+            <w:r>
+              <w:t xml:space="preserve">0.4</w:t>
+            </w:r>
+          </w:p>
+        </w:tc>
+      </w:tr>
+      <w:tr>
+        <w:tc>
+          <w:p>
+            <w:pPr>
+              <w:pStyle w:val="Compact"/>
+              <w:jc w:val="left"/>
+            </w:pPr>
+            <w:r>
+              <w:t xml:space="preserve">Gemini Flash-Lite</w:t>
+            </w:r>
+          </w:p>
+        </w:tc>
+        <w:tc>
+          <w:p>
+            <w:pPr>
+              <w:pStyle w:val="Compact"/>
+              <w:jc w:val="right"/>
+            </w:pPr>
+            <w:r>
+              <w:t xml:space="preserve">24.7</w:t>
+            </w:r>
+          </w:p>
+        </w:tc>
+        <w:tc>
+          <w:p>
+            <w:pPr>
+              <w:pStyle w:val="Compact"/>
+              <w:jc w:val="left"/>
+            </w:pPr>
+            <w:r>
+              <w:t xml:space="preserve">247</w:t>
+            </w:r>
+            <w:r>
+              <w:t xml:space="preserve">,</w:t>
+            </w:r>
+            <w:r>
+              <w:t xml:space="preserve">000 (202</w:t>
+            </w:r>
+            <w:r>
+              <w:t xml:space="preserve">,</w:t>
+            </w:r>
+            <w:r>
+              <w:t xml:space="preserve">000–299</w:t>
+            </w:r>
+            <w:r>
+              <w:t xml:space="preserve">,</w:t>
+            </w:r>
+            <w:r>
+              <w:t xml:space="preserve">000)</w:t>
+            </w:r>
+          </w:p>
+        </w:tc>
+        <w:tc>
+          <w:p>
+            <w:pPr>
+              <w:pStyle w:val="Compact"/>
+              <w:jc w:val="right"/>
+            </w:pPr>
+            <w:r>
+              <w:t xml:space="preserve">0.4</w:t>
+            </w:r>
+          </w:p>
+        </w:tc>
+      </w:tr>
+      <w:tr>
+        <w:tc>
+          <w:p>
+            <w:pPr>
+              <w:pStyle w:val="Compact"/>
+              <w:jc w:val="left"/>
+            </w:pPr>
+            <w:r>
+              <w:t xml:space="preserve">GPT-4o-mini</w:t>
+            </w:r>
+          </w:p>
+        </w:tc>
+        <w:tc>
+          <w:p>
+            <w:pPr>
+              <w:pStyle w:val="Compact"/>
+              <w:jc w:val="right"/>
+            </w:pPr>
+            <w:r>
+              <w:t xml:space="preserve">83.0</w:t>
+            </w:r>
+          </w:p>
+        </w:tc>
+        <w:tc>
+          <w:p>
+            <w:pPr>
+              <w:pStyle w:val="Compact"/>
+              <w:jc w:val="left"/>
+            </w:pPr>
+            <w:r>
+              <w:t xml:space="preserve">830</w:t>
+            </w:r>
+            <w:r>
+              <w:t xml:space="preserve">,</w:t>
+            </w:r>
+            <w:r>
+              <w:t xml:space="preserve">000 (784</w:t>
+            </w:r>
+            <w:r>
+              <w:t xml:space="preserve">,</w:t>
+            </w:r>
+            <w:r>
+              <w:t xml:space="preserve">000–868</w:t>
+            </w:r>
+            <w:r>
+              <w:t xml:space="preserve">,</w:t>
+            </w:r>
+            <w:r>
+              <w:t xml:space="preserve">000)</w:t>
+            </w:r>
+          </w:p>
+        </w:tc>
+        <w:tc>
+          <w:p>
+            <w:pPr>
+              <w:pStyle w:val="Compact"/>
+              <w:jc w:val="right"/>
+            </w:pPr>
+            <w:r>
+              <w:t xml:space="preserve">0.1</w:t>
+            </w:r>
+          </w:p>
+        </w:tc>
+      </w:tr>
+      <w:tr>
+        <w:tc>
+          <w:p/>
+        </w:tc>
+        <w:tc>
+          <w:p/>
+        </w:tc>
+        <w:tc>
+          <w:p/>
+        </w:tc>
+        <w:tc>
+          <w:p/>
+        </w:tc>
+      </w:tr>
+    </w:tbl>
+    <w:bookmarkEnd w:id="51"/>
+    <w:bookmarkStart w:id="52" w:name="tab:vote"/>
+    <w:p>
+      <w:pPr>
+        <w:pStyle w:val="TableCaption"/>
+      </w:pPr>
+      <w:r>
+        <w:rPr>
+          <w:b/>
+        </w:rPr>
+        <w:t xml:space="preserve">Per-case endpoint aggregation rule.</w:t>
+      </w:r>
+      <w:r>
+        <w:t xml:space="preserve"> </w:t>
+      </w:r>
+      <w:r>
+        <w:t xml:space="preserve">The rule was fixed in advance (preregistration decision D4); it was applied identically to every model.</w:t>
+      </w:r>
+    </w:p>
+    <w:tbl>
+      <w:tblPr>
+        <w:tblStyle w:val="Table"/>
+        <w:tblW w:type="pct" w:w="0.0"/>
+        <w:tblLook w:firstRow="1"/>
+        <w:tblCaption w:val="Per-case endpoint aggregation rule. The rule was fixed in advance (preregistration decision D4); it was applied identically to every model."/>
+      </w:tblPr>
+      <w:tblGrid/>
+      <w:tr>
+        <w:trPr>
+          <w:cnfStyle w:firstRow="1"/>
+        </w:trPr>
+        <w:tc>
+          <w:tcPr>
+            <w:tcBorders>
+              <w:bottom w:val="single"/>
+            </w:tcBorders>
+            <w:vAlign w:val="bottom"/>
+          </w:tcPr>
+          <w:p>
+            <w:pPr>
+              <w:pStyle w:val="Compact"/>
+              <w:jc w:val="left"/>
+            </w:pPr>
+            <w:r>
+              <w:t xml:space="preserve">Element</w:t>
+            </w:r>
+          </w:p>
+        </w:tc>
+        <w:tc>
+          <w:tcPr>
+            <w:tcBorders>
+              <w:bottom w:val="single"/>
+            </w:tcBorders>
+            <w:vAlign w:val="bottom"/>
+          </w:tcPr>
+          <w:p>
+            <w:pPr>
+              <w:pStyle w:val="Compact"/>
+              <w:jc w:val="left"/>
+            </w:pPr>
+            <w:r>
+              <w:t xml:space="preserve">Rule</w:t>
+            </w:r>
+          </w:p>
+        </w:tc>
+      </w:tr>
+      <w:tr>
+        <w:tc>
+          <w:p>
+            <w:pPr>
+              <w:pStyle w:val="Compact"/>
+              <w:jc w:val="left"/>
+            </w:pPr>
+            <w:r>
+              <w:t xml:space="preserve">Replicate calls per case</w:t>
+            </w:r>
+          </w:p>
+        </w:tc>
+        <w:tc>
+          <w:p>
+            <w:pPr>
+              <w:pStyle w:val="Compact"/>
+              <w:jc w:val="left"/>
+            </w:pPr>
+            <w:r>
+              <w:t xml:space="preserve">The valid (non-ERROR) calls for each (model, case): four by design (two prompt phrasings</w:t>
+            </w:r>
+            <w:r>
+              <w:t xml:space="preserve"> </w:t>
+            </w:r>
+            <m:oMath>
+              <m:r>
+                <m:t>×</m:t>
+              </m:r>
+            </m:oMath>
+            <w:r>
+              <w:t xml:space="preserve"> </w:t>
+            </w:r>
+            <w:r>
+              <w:t xml:space="preserve">two seeds); a small number of cases carry one additional retried call</w:t>
+            </w:r>
+          </w:p>
+        </w:tc>
+      </w:tr>
+      <w:tr>
+        <w:tc>
+          <w:p>
+            <w:pPr>
+              <w:pStyle w:val="Compact"/>
+              <w:jc w:val="left"/>
+            </w:pPr>
+            <w:r>
+              <w:t xml:space="preserve">Failed / unparsable calls</w:t>
+            </w:r>
+          </w:p>
+        </w:tc>
+        <w:tc>
+          <w:p>
+            <w:pPr>
+              <w:pStyle w:val="Compact"/>
+              <w:jc w:val="left"/>
+            </w:pPr>
+            <w:r>
+              <w:t xml:space="preserve">Recorded as ERROR and excluded from the vote (the denominator is reduced accordingly); overall ERROR rate 0.08%</w:t>
+            </w:r>
+          </w:p>
+        </w:tc>
+      </w:tr>
+      <w:tr>
+        <w:tc>
+          <w:p>
+            <w:pPr>
+              <w:pStyle w:val="Compact"/>
+              <w:jc w:val="left"/>
+            </w:pPr>
+            <w:r>
+              <w:t xml:space="preserve">Legitimate (benign) case</w:t>
+            </w:r>
+          </w:p>
+        </w:tc>
+        <w:tc>
+          <w:p>
+            <w:pPr>
+              <w:pStyle w:val="Compact"/>
+              <w:jc w:val="left"/>
+            </w:pPr>
+            <w:r>
+              <w:t xml:space="preserve">Counted as a false positive only if a strict majority of valid calls flagged it (flags</w:t>
+            </w:r>
+            <w:r>
+              <w:t xml:space="preserve"> </w:t>
+            </w:r>
+            <m:oMath>
+              <m:r>
+                <m:t>&gt;</m:t>
+              </m:r>
+            </m:oMath>
+            <w:r>
+              <w:t xml:space="preserve"> </w:t>
+            </w:r>
+            <w:r>
+              <w:t xml:space="preserve">half); a 2–2 tie is not counted as a false positive</w:t>
+            </w:r>
+          </w:p>
+        </w:tc>
+      </w:tr>
+      <w:tr>
+        <w:tc>
+          <w:p>
+            <w:pPr>
+              <w:pStyle w:val="Compact"/>
+              <w:jc w:val="left"/>
+            </w:pPr>
+            <w:r>
+              <w:t xml:space="preserve">Suspicious case</w:t>
+            </w:r>
+          </w:p>
+        </w:tc>
+        <w:tc>
+          <w:p>
+            <w:pPr>
+              <w:pStyle w:val="Compact"/>
+              <w:jc w:val="left"/>
+            </w:pPr>
+            <w:r>
+              <w:t xml:space="preserve">Counted as caught (not missed) if at least half of valid calls flagged it (flags</w:t>
+            </w:r>
+            <w:r>
+              <w:t xml:space="preserve"> </w:t>
+            </w:r>
+            <m:oMath>
+              <m:r>
+                <m:t>≥</m:t>
+              </m:r>
+            </m:oMath>
+            <w:r>
+              <w:t xml:space="preserve"> </w:t>
+            </w:r>
+            <w:r>
+              <w:t xml:space="preserve">half); a 2–2 tie is counted as caught</w:t>
+            </w:r>
+          </w:p>
+        </w:tc>
+      </w:tr>
+      <w:tr>
+        <w:tc>
+          <w:p>
+            <w:pPr>
+              <w:pStyle w:val="Compact"/>
+              <w:jc w:val="left"/>
+            </w:pPr>
+            <w:r>
+              <w:t xml:space="preserve">Even-split ties</w:t>
+            </w:r>
+          </w:p>
+        </w:tc>
+        <w:tc>
+          <w:p>
+            <w:pPr>
+              <w:pStyle w:val="Compact"/>
+              <w:jc w:val="left"/>
+            </w:pPr>
+            <w:r>
+              <w:t xml:space="preserve">Occurred and were resolved as above, affecting 132 of the 1</w:t>
+            </w:r>
+            <w:r>
+              <w:t xml:space="preserve">,</w:t>
+            </w:r>
+            <w:r>
+              <w:t xml:space="preserve">500 benign and 48 of the 1</w:t>
+            </w:r>
+            <w:r>
+              <w:t xml:space="preserve">,</w:t>
+            </w:r>
+            <w:r>
+              <w:t xml:space="preserve">500 suspicious model–case decisions</w:t>
+            </w:r>
+          </w:p>
+        </w:tc>
+      </w:tr>
+      <w:tr>
         <w:tc>
           <w:p/>
         </w:tc>

</xml_diff>

<commit_message>
Add missing declarations (consent, materials); fix SciPy version, table numbering, figure captions; refresh READMEs; 12pt cover letter; drop orphaned figures and stale markdown
</commit_message>
<xml_diff>
--- a/manuscript/MANUSCRIPT_Discover.docx
+++ b/manuscript/MANUSCRIPT_Discover.docx
@@ -4737,13 +4737,47 @@
         <w:rPr>
           <w:b/>
         </w:rPr>
-        <w:t xml:space="preserve">Ethics approval.</w:t>
+        <w:t xml:space="preserve">Ethics approval and consent to participate.</w:t>
       </w:r>
       <w:r>
         <w:t xml:space="preserve"> </w:t>
       </w:r>
       <w:r>
         <w:t xml:space="preserve">Not applicable (synthetic data only; no human participants, human tissue or animals).</w:t>
+      </w:r>
+    </w:p>
+    <w:p>
+      <w:pPr>
+        <w:pStyle w:val="BodyText"/>
+      </w:pPr>
+      <w:r>
+        <w:rPr>
+          <w:b/>
+        </w:rPr>
+        <w:t xml:space="preserve">Consent for publication.</w:t>
+      </w:r>
+      <w:r>
+        <w:t xml:space="preserve"> </w:t>
+      </w:r>
+      <w:r>
+        <w:t xml:space="preserve">Not applicable.</w:t>
+      </w:r>
+    </w:p>
+    <w:p>
+      <w:pPr>
+        <w:pStyle w:val="BodyText"/>
+      </w:pPr>
+      <w:r>
+        <w:rPr>
+          <w:b/>
+        </w:rPr>
+        <w:t xml:space="preserve">Materials availability.</w:t>
+      </w:r>
+      <w:r>
+        <w:t xml:space="preserve"> </w:t>
+      </w:r>
+      <w:r>
+        <w:t xml:space="preserve">Not applicable (the study uses only synthetic data and open-source software; no physical materials).</w:t>
       </w:r>
     </w:p>
     <w:p>

</xml_diff>

<commit_message>
Cite and finalize SI (single PDF, deduplicated); drop unused fig6/fig7 and fix capsule README to fig1-fig5
</commit_message>
<xml_diff>
--- a/manuscript/MANUSCRIPT_Discover.docx
+++ b/manuscript/MANUSCRIPT_Discover.docx
@@ -345,7 +345,7 @@
         <w:pStyle w:val="BodyText"/>
       </w:pPr>
       <w:r>
-        <w:t xml:space="preserve">The battery was balanced by design. Three hundred cases represented suspicious activity, spread across eight laundering typologies: structuring, layering, trade-based laundering, mule networks, shell layering, funnel accounts, rapid pass-through activity, and cash-intensive fronts. The other 300 cases were legitimate hard negatives. These benign cases included patterns such as payroll processing, treasury sweeps, documented trade-finance activity and marketplace payouts that might appear superficially similar to traditional AML red flags. Hard negatives were included deliberately to prevent a model from performing well simply by flagging every case as suspicious.</w:t>
+        <w:t xml:space="preserve">The battery was balanced by design. Three hundred cases represented suspicious activity, spread across eight laundering typologies: structuring, layering, trade-based laundering, mule networks, shell layering, funnel accounts, rapid pass-through activity, and cash-intensive fronts. The other 300 cases were legitimate hard negatives (the full battery composition is given in Supplementary Table S1). These benign cases included patterns such as payroll processing, treasury sweeps, documented trade-finance activity and marketplace payouts that might appear superficially similar to traditional AML red flags. Hard negatives were included deliberately to prevent a model from performing well simply by flagging every case as suspicious.</w:t>
       </w:r>
     </w:p>
     <w:p>
@@ -1580,7 +1580,7 @@
         </w:r>
       </w:hyperlink>
       <w:r>
-        <w:t xml:space="preserve">), they were not evenly distributed across the suspicious cases. Trade-based laundering had the highest pooled miss rate, at 18.9% (95% CI 14.0–25.1), followed by cash-intensive fronts at 10.3%. Pooled miss rates for structuring, layering, mule networks, funnel accounts, shell layering and rapid pass-through activity were 1.6% or less.</w:t>
+        <w:t xml:space="preserve">), they were not evenly distributed across the suspicious cases. Trade-based laundering had the highest pooled miss rate, at 18.9% (95% CI 14.0–25.1), followed by cash-intensive fronts at 10.3%. Pooled miss rates for structuring, layering, mule networks, funnel accounts, shell layering and rapid pass-through activity were 1.6% or less (per-typology rates in Supplementary Table S2).</w:t>
       </w:r>
     </w:p>
     <w:p>
@@ -1717,7 +1717,7 @@
         <w:t xml:space="preserve"> </w:t>
       </w:r>
       <w:r>
-        <w:t xml:space="preserve">and Gwet’s AC1 gave consistent conclusions. The dominant cross-model phenomenon was therefore not a common set of missed suspicious cases, but a large divergence in the aggressiveness with which legitimate activity was escalated.</w:t>
+        <w:t xml:space="preserve">and Gwet’s AC1 gave consistent conclusions (Supplementary Table S3). The dominant cross-model phenomenon was therefore not a common set of missed suspicious cases, but a large divergence in the aggressiveness with which legitimate activity was escalated.</w:t>
       </w:r>
     </w:p>
     <w:p>
@@ -4401,6 +4401,14 @@
       </w:tr>
     </w:tbl>
     <w:bookmarkEnd w:id="52"/>
+    <w:p>
+      <w:pPr>
+        <w:pStyle w:val="BodyText"/>
+      </w:pPr>
+      <w:r>
+        <w:t xml:space="preserve">Supplementary Information is provided as a single PDF and contains a Supplementary Note (preregistration and design), Supplementary Table S1 (battery composition), Supplementary Table S2 (per-typology miss rate), Supplementary Table S3 (correlated-miss null), and Supplementary Methods (baselines).</w:t>
+      </w:r>
+    </w:p>
     <w:p>
       <w:pPr>
         <w:pStyle w:val="BodyText"/>

</xml_diff>

<commit_message>
Rename repo references to ai-foundation-model-aml-false-positives; correct README dependency list
</commit_message>
<xml_diff>
--- a/manuscript/MANUSCRIPT_Discover.docx
+++ b/manuscript/MANUSCRIPT_Discover.docx
@@ -7,37 +7,25 @@
         <w:pStyle w:val="Title"/>
       </w:pPr>
       <w:r>
-        <w:t xml:space="preserve">Same</w:t>
-      </w:r>
-      <w:r>
-        <w:t xml:space="preserve"> </w:t>
-      </w:r>
-      <w:r>
-        <w:t xml:space="preserve">Transactions,</w:t>
-      </w:r>
-      <w:r>
-        <w:t xml:space="preserve"> </w:t>
-      </w:r>
-      <w:r>
-        <w:t xml:space="preserve">Different</w:t>
-      </w:r>
-      <w:r>
-        <w:t xml:space="preserve"> </w:t>
-      </w:r>
-      <w:r>
-        <w:t xml:space="preserve">Alarms:</w:t>
-      </w:r>
-      <w:r>
-        <w:t xml:space="preserve"> </w:t>
-      </w:r>
-      <w:r>
-        <w:t xml:space="preserve">Foundation-Model</w:t>
-      </w:r>
-      <w:r>
-        <w:t xml:space="preserve"> </w:t>
-      </w:r>
-      <w:r>
-        <w:t xml:space="preserve">Choice</w:t>
+        <w:t xml:space="preserve">AI</w:t>
+      </w:r>
+      <w:r>
+        <w:t xml:space="preserve"> </w:t>
+      </w:r>
+      <w:r>
+        <w:t xml:space="preserve">foundation</w:t>
+      </w:r>
+      <w:r>
+        <w:t xml:space="preserve"> </w:t>
+      </w:r>
+      <w:r>
+        <w:t xml:space="preserve">model</w:t>
+      </w:r>
+      <w:r>
+        <w:t xml:space="preserve"> </w:t>
+      </w:r>
+      <w:r>
+        <w:t xml:space="preserve">choice</w:t>
       </w:r>
       <w:r>
         <w:t xml:space="preserve"> </w:t>
@@ -49,19 +37,55 @@
         <w:t xml:space="preserve"> </w:t>
       </w:r>
       <w:r>
-        <w:t xml:space="preserve">AML</w:t>
-      </w:r>
-      <w:r>
-        <w:t xml:space="preserve"> </w:t>
-      </w:r>
-      <w:r>
-        <w:t xml:space="preserve">False</w:t>
-      </w:r>
-      <w:r>
-        <w:t xml:space="preserve"> </w:t>
-      </w:r>
-      <w:r>
-        <w:t xml:space="preserve">Positives</w:t>
+        <w:t xml:space="preserve">false</w:t>
+      </w:r>
+      <w:r>
+        <w:t xml:space="preserve"> </w:t>
+      </w:r>
+      <w:r>
+        <w:t xml:space="preserve">positive</w:t>
+      </w:r>
+      <w:r>
+        <w:t xml:space="preserve"> </w:t>
+      </w:r>
+      <w:r>
+        <w:t xml:space="preserve">variation</w:t>
+      </w:r>
+      <w:r>
+        <w:t xml:space="preserve"> </w:t>
+      </w:r>
+      <w:r>
+        <w:t xml:space="preserve">in</w:t>
+      </w:r>
+      <w:r>
+        <w:t xml:space="preserve"> </w:t>
+      </w:r>
+      <w:r>
+        <w:t xml:space="preserve">Anti</w:t>
+      </w:r>
+      <w:r>
+        <w:t xml:space="preserve"> </w:t>
+      </w:r>
+      <w:r>
+        <w:t xml:space="preserve">Money</w:t>
+      </w:r>
+      <w:r>
+        <w:t xml:space="preserve"> </w:t>
+      </w:r>
+      <w:r>
+        <w:t xml:space="preserve">Laundering</w:t>
+      </w:r>
+      <w:r>
+        <w:t xml:space="preserve"> </w:t>
+      </w:r>
+      <w:r>
+        <w:t xml:space="preserve">transaction</w:t>
+      </w:r>
+      <w:r>
+        <w:t xml:space="preserve"> </w:t>
+      </w:r>
+      <w:r>
+        <w:t xml:space="preserve">screening</w:t>
       </w:r>
     </w:p>
     <w:p>
@@ -4492,21 +4516,7 @@
         <w:t xml:space="preserve"> </w:t>
       </w:r>
       <w:r>
-        <w:t xml:space="preserve">(MIT licence) and, identically, in the public GitHub repository at</w:t>
-      </w:r>
-      <w:r>
-        <w:t xml:space="preserve"> </w:t>
-      </w:r>
-      <w:hyperlink r:id="rId55">
-        <w:r>
-          <w:rPr>
-            <w:rStyle w:val="Hyperlink"/>
-          </w:rPr>
-          <w:t xml:space="preserve">https://github.com/samirrc2/same-transactions-different-alarms</w:t>
-        </w:r>
-      </w:hyperlink>
-      <w:r>
-        <w:t xml:space="preserve">. Within the capsule, the</w:t>
+        <w:t xml:space="preserve">(MIT licence). Within the capsule, the</w:t>
       </w:r>
       <w:r>
         <w:t xml:space="preserve"> </w:t>
@@ -4706,7 +4716,7 @@
         <w:t xml:space="preserve"> </w:t>
       </w:r>
       <w:r>
-        <w:t xml:space="preserve">The analysis and reproducibility code—which regenerates and hash-verifies the battery, recomputes every reported statistic, and confirms byte-identical outputs across runs—is available in the same GitHub repository and Code Ocean capsule (</w:t>
+        <w:t xml:space="preserve">The analysis and reproducibility code—which regenerates and hash-verifies the battery, recomputes every reported statistic, and confirms byte-identical outputs across runs—is available in the Code Ocean capsule (</w:t>
       </w:r>
       <w:hyperlink r:id="rId54">
         <w:r>
@@ -4826,11 +4836,11 @@
       <w:pPr>
         <w:pStyle w:val="Heading1"/>
       </w:pPr>
-      <w:bookmarkStart w:id="56" w:name="references"/>
+      <w:bookmarkStart w:id="55" w:name="references"/>
       <w:r>
         <w:t xml:space="preserve">References</w:t>
       </w:r>
-      <w:bookmarkEnd w:id="56"/>
+      <w:bookmarkEnd w:id="55"/>
     </w:p>
     <w:p>
       <w:pPr>
@@ -4845,7 +4855,7 @@
       <w:r>
         <w:t xml:space="preserve"> </w:t>
       </w:r>
-      <w:hyperlink r:id="rId57">
+      <w:hyperlink r:id="rId56">
         <w:r>
           <w:rPr>
             <w:rStyle w:val="Hyperlink"/>
@@ -4867,7 +4877,7 @@
       <w:r>
         <w:t xml:space="preserve"> </w:t>
       </w:r>
-      <w:hyperlink r:id="rId58">
+      <w:hyperlink r:id="rId57">
         <w:r>
           <w:rPr>
             <w:rStyle w:val="Hyperlink"/>
@@ -4930,7 +4940,7 @@
       <w:r>
         <w:t xml:space="preserve"> </w:t>
       </w:r>
-      <w:hyperlink r:id="rId59">
+      <w:hyperlink r:id="rId58">
         <w:r>
           <w:rPr>
             <w:rStyle w:val="Hyperlink"/>
@@ -4952,7 +4962,7 @@
       <w:r>
         <w:t xml:space="preserve"> </w:t>
       </w:r>
-      <w:hyperlink r:id="rId60">
+      <w:hyperlink r:id="rId59">
         <w:r>
           <w:rPr>
             <w:rStyle w:val="Hyperlink"/>
@@ -5051,7 +5061,7 @@
       <w:r>
         <w:t xml:space="preserve"> </w:t>
       </w:r>
-      <w:hyperlink r:id="rId61">
+      <w:hyperlink r:id="rId60">
         <w:r>
           <w:rPr>
             <w:rStyle w:val="Hyperlink"/>
@@ -5073,7 +5083,7 @@
       <w:r>
         <w:t xml:space="preserve"> </w:t>
       </w:r>
-      <w:hyperlink r:id="rId62">
+      <w:hyperlink r:id="rId61">
         <w:r>
           <w:rPr>
             <w:rStyle w:val="Hyperlink"/>
@@ -5095,7 +5105,7 @@
       <w:r>
         <w:t xml:space="preserve"> </w:t>
       </w:r>
-      <w:hyperlink r:id="rId63">
+      <w:hyperlink r:id="rId62">
         <w:r>
           <w:rPr>
             <w:rStyle w:val="Hyperlink"/>
@@ -5117,7 +5127,7 @@
       <w:r>
         <w:t xml:space="preserve"> </w:t>
       </w:r>
-      <w:hyperlink r:id="rId64">
+      <w:hyperlink r:id="rId63">
         <w:r>
           <w:rPr>
             <w:rStyle w:val="Hyperlink"/>
@@ -5139,7 +5149,7 @@
       <w:r>
         <w:t xml:space="preserve"> </w:t>
       </w:r>
-      <w:hyperlink r:id="rId65">
+      <w:hyperlink r:id="rId64">
         <w:r>
           <w:rPr>
             <w:rStyle w:val="Hyperlink"/>
@@ -5224,7 +5234,7 @@
       <w:r>
         <w:t xml:space="preserve"> </w:t>
       </w:r>
-      <w:hyperlink r:id="rId66">
+      <w:hyperlink r:id="rId65">
         <w:r>
           <w:rPr>
             <w:rStyle w:val="Hyperlink"/>
@@ -5246,7 +5256,7 @@
       <w:r>
         <w:t xml:space="preserve"> </w:t>
       </w:r>
-      <w:hyperlink r:id="rId67">
+      <w:hyperlink r:id="rId66">
         <w:r>
           <w:rPr>
             <w:rStyle w:val="Hyperlink"/>
@@ -5309,7 +5319,7 @@
       <w:r>
         <w:t xml:space="preserve"> </w:t>
       </w:r>
-      <w:hyperlink r:id="rId68">
+      <w:hyperlink r:id="rId67">
         <w:r>
           <w:rPr>
             <w:rStyle w:val="Hyperlink"/>
@@ -5331,7 +5341,7 @@
       <w:r>
         <w:t xml:space="preserve"> </w:t>
       </w:r>
-      <w:hyperlink r:id="rId69">
+      <w:hyperlink r:id="rId68">
         <w:r>
           <w:rPr>
             <w:rStyle w:val="Hyperlink"/>
@@ -5359,7 +5369,7 @@
       <w:r>
         <w:t xml:space="preserve"> </w:t>
       </w:r>
-      <w:hyperlink r:id="rId70">
+      <w:hyperlink r:id="rId69">
         <w:r>
           <w:rPr>
             <w:rStyle w:val="Hyperlink"/>
@@ -5387,7 +5397,7 @@
       <w:r>
         <w:t xml:space="preserve"> </w:t>
       </w:r>
-      <w:hyperlink r:id="rId71">
+      <w:hyperlink r:id="rId70">
         <w:r>
           <w:rPr>
             <w:rStyle w:val="Hyperlink"/>
@@ -5409,7 +5419,7 @@
       <w:r>
         <w:t xml:space="preserve"> </w:t>
       </w:r>
-      <w:hyperlink r:id="rId72">
+      <w:hyperlink r:id="rId71">
         <w:r>
           <w:rPr>
             <w:rStyle w:val="Hyperlink"/>
@@ -5453,7 +5463,7 @@
       <w:r>
         <w:t xml:space="preserve"> </w:t>
       </w:r>
-      <w:hyperlink r:id="rId73">
+      <w:hyperlink r:id="rId72">
         <w:r>
           <w:rPr>
             <w:rStyle w:val="Hyperlink"/>
@@ -5475,7 +5485,7 @@
       <w:r>
         <w:t xml:space="preserve"> </w:t>
       </w:r>
-      <w:hyperlink r:id="rId74">
+      <w:hyperlink r:id="rId73">
         <w:r>
           <w:rPr>
             <w:rStyle w:val="Hyperlink"/>
@@ -5497,7 +5507,7 @@
       <w:r>
         <w:t xml:space="preserve"> </w:t>
       </w:r>
-      <w:hyperlink r:id="rId75">
+      <w:hyperlink r:id="rId74">
         <w:r>
           <w:rPr>
             <w:rStyle w:val="Hyperlink"/>
@@ -5608,7 +5618,7 @@
       <w:r>
         <w:t xml:space="preserve"> </w:t>
       </w:r>
-      <w:hyperlink r:id="rId76">
+      <w:hyperlink r:id="rId75">
         <w:r>
           <w:rPr>
             <w:rStyle w:val="Hyperlink"/>
@@ -5642,7 +5652,7 @@
       <w:r>
         <w:t xml:space="preserve"> </w:t>
       </w:r>
-      <w:hyperlink r:id="rId77">
+      <w:hyperlink r:id="rId76">
         <w:r>
           <w:rPr>
             <w:rStyle w:val="Hyperlink"/>
@@ -5694,7 +5704,7 @@
       <w:r>
         <w:t xml:space="preserve"> </w:t>
       </w:r>
-      <w:hyperlink r:id="rId78">
+      <w:hyperlink r:id="rId77">
         <w:r>
           <w:rPr>
             <w:rStyle w:val="Hyperlink"/>
@@ -5766,7 +5776,7 @@
       <w:r>
         <w:t xml:space="preserve"> </w:t>
       </w:r>
-      <w:hyperlink r:id="rId79">
+      <w:hyperlink r:id="rId78">
         <w:r>
           <w:rPr>
             <w:rStyle w:val="Hyperlink"/>
@@ -5788,7 +5798,7 @@
       <w:r>
         <w:t xml:space="preserve"> </w:t>
       </w:r>
-      <w:hyperlink r:id="rId80">
+      <w:hyperlink r:id="rId79">
         <w:r>
           <w:rPr>
             <w:rStyle w:val="Hyperlink"/>

</xml_diff>

<commit_message>
Manuscript: make GitHub the data/code source and cite REPRODUCIBILITY_DOCUMENTATION.pdf; keep Code Ocean in repo README
</commit_message>
<xml_diff>
--- a/manuscript/MANUSCRIPT_Discover.docx
+++ b/manuscript/MANUSCRIPT_Discover.docx
@@ -4499,7 +4499,7 @@
         <w:t xml:space="preserve"> </w:t>
       </w:r>
       <w:r>
-        <w:t xml:space="preserve">All data and code required to reproduce the study are openly available in a deterministic Code Ocean capsule at</w:t>
+        <w:t xml:space="preserve">All data and code required to reproduce the study are openly available in the public GitHub repository at</w:t>
       </w:r>
       <w:r>
         <w:t xml:space="preserve"> </w:t>
@@ -4509,14 +4509,35 @@
           <w:rPr>
             <w:rStyle w:val="Hyperlink"/>
           </w:rPr>
-          <w:t xml:space="preserve">https://doi.org/10.24433/CO.4804007.v1</w:t>
+          <w:t xml:space="preserve">https://github.com/samirrc2/ai-foundation-model-aml-false-positives</w:t>
         </w:r>
       </w:hyperlink>
       <w:r>
         <w:t xml:space="preserve"> </w:t>
       </w:r>
       <w:r>
-        <w:t xml:space="preserve">(MIT licence). Within the capsule, the</w:t>
+        <w:t xml:space="preserve">(MIT licence); the repository root includes</w:t>
+      </w:r>
+      <w:r>
+        <w:t xml:space="preserve"> </w:t>
+      </w:r>
+      <w:r>
+        <w:rPr>
+          <w:rStyle w:val="VerbatimChar"/>
+        </w:rPr>
+        <w:t xml:space="preserve">REPRODUCIBILITY_DOCUMENTATION.pdf</w:t>
+      </w:r>
+      <w:r>
+        <w:t xml:space="preserve">, a section-by-section guide to every input, script, and output and to the one-command offline reproduction. Within the repository’s reproducibility capsule (</w:t>
+      </w:r>
+      <w:r>
+        <w:rPr>
+          <w:rStyle w:val="VerbatimChar"/>
+        </w:rPr>
+        <w:t xml:space="preserve">capsule/</w:t>
+      </w:r>
+      <w:r>
+        <w:t xml:space="preserve">), the</w:t>
       </w:r>
       <w:r>
         <w:t xml:space="preserve"> </w:t>
@@ -4606,7 +4627,7 @@
         <w:t xml:space="preserve"> </w:t>
       </w:r>
       <w:r>
-        <w:t xml:space="preserve">600 cases, each row carrying the raw model JSON, the served-model fingerprint, token counts and per-call cost); the per-file SHA-256 freeze receipts (</w:t>
+        <w:t xml:space="preserve">600 cases, each row carrying the raw model JSON, the served-model identifier, token counts and per-call cost); the per-file SHA-256 freeze receipts (</w:t>
       </w:r>
       <w:r>
         <w:rPr>
@@ -4642,7 +4663,7 @@
         <w:rPr>
           <w:rStyle w:val="VerbatimChar"/>
         </w:rPr>
-        <w:t xml:space="preserve">docs/</w:t>
+        <w:t xml:space="preserve">capsule/docs/</w:t>
       </w:r>
       <w:r>
         <w:t xml:space="preserve">, the deterministic analysis in</w:t>
@@ -4654,7 +4675,7 @@
         <w:rPr>
           <w:rStyle w:val="VerbatimChar"/>
         </w:rPr>
-        <w:t xml:space="preserve">code/</w:t>
+        <w:t xml:space="preserve">capsule/code/</w:t>
       </w:r>
       <w:r>
         <w:t xml:space="preserve">, and pre-computed outputs in</w:t>
@@ -4666,7 +4687,7 @@
         <w:rPr>
           <w:rStyle w:val="VerbatimChar"/>
         </w:rPr>
-        <w:t xml:space="preserve">results/</w:t>
+        <w:t xml:space="preserve">capsule/results/</w:t>
       </w:r>
       <w:r>
         <w:t xml:space="preserve"> </w:t>
@@ -4693,7 +4714,7 @@
         <w:rPr>
           <w:rStyle w:val="VerbatimChar"/>
         </w:rPr>
-        <w:t xml:space="preserve">reproduce.sh</w:t>
+        <w:t xml:space="preserve">capsule/reproduce.sh</w:t>
       </w:r>
       <w:r>
         <w:t xml:space="preserve"> </w:t>
@@ -4716,18 +4737,33 @@
         <w:t xml:space="preserve"> </w:t>
       </w:r>
       <w:r>
-        <w:t xml:space="preserve">The analysis and reproducibility code—which regenerates and hash-verifies the battery, recomputes every reported statistic, and confirms byte-identical outputs across runs—is available in the Code Ocean capsule (</w:t>
+        <w:t xml:space="preserve">The analysis and reproducibility code—which regenerates and hash-verifies the battery, recomputes every reported statistic, and confirms byte-identical outputs across runs—is available in the same GitHub repository (</w:t>
       </w:r>
       <w:hyperlink r:id="rId54">
         <w:r>
           <w:rPr>
             <w:rStyle w:val="Hyperlink"/>
           </w:rPr>
-          <w:t xml:space="preserve">https://doi.org/10.24433/CO.4804007.v1</w:t>
+          <w:t xml:space="preserve">https://github.com/samirrc2/ai-foundation-model-aml-false-positives</w:t>
         </w:r>
       </w:hyperlink>
       <w:r>
-        <w:t xml:space="preserve">). The default Reproducible Run requires no API keys or network access. The code is released under the MIT licence.</w:t>
+        <w:t xml:space="preserve">); its use is documented in</w:t>
+      </w:r>
+      <w:r>
+        <w:t xml:space="preserve"> </w:t>
+      </w:r>
+      <w:r>
+        <w:rPr>
+          <w:rStyle w:val="VerbatimChar"/>
+        </w:rPr>
+        <w:t xml:space="preserve">REPRODUCIBILITY_DOCUMENTATION.pdf</w:t>
+      </w:r>
+      <w:r>
+        <w:t xml:space="preserve"> </w:t>
+      </w:r>
+      <w:r>
+        <w:t xml:space="preserve">at the repository root. The default offline reproduction requires no API keys or network access. The code is released under the MIT licence.</w:t>
       </w:r>
     </w:p>
     <w:p>

</xml_diff>